<commit_message>
Italicize Latin/French terms; remove notification-vs-monitoring false choice
- Italicized pro se and de facto everywhere they appear, including in the
  Part D heading and the signature block.
- Rewrote Part A.5's requested relief: the lead ask is now that neither
  notification nor employer monitoring-consent is owed at all, consistent
  with A.1/A.3's "no employer-facing restriction exists" framing. The
  either/or Path 1/Path 2 structure is preserved only as an alternative
  fallback, explicitly noting Bernecky has already satisfied it regardless
  - not a choice he should ever have to make.
</commit_message>
<xml_diff>
--- a/case-files/bernecky/MOTION-DRAFT.docx
+++ b/case-files/bernecky/MOTION-DRAFT.docx
@@ -134,7 +134,33 @@
           <w:color w:val="000000"/>
           <w:sz w:val="24"/>
         </w:rPr>
-        <w:t xml:space="preserve">Defendant Jeffrey Bernecky, proceeding pro se, respectfully moves this Court, pursuant to 18 U.S.C. § 3583(e)(2) and Federal Rule of Criminal Procedure 32.1(c), to modify the conditions of supervised release imposed by the Judgment entered June 12, 2018 (Dkt. 28). In support of this motion, Mr. Bernecky states as follows.</w:t>
+        <w:t xml:space="preserve">Defendant Jeffrey Bernecky, proceeding</w:t>
+      </w:r>
+      <w:r>
+        <w:rPr>
+          <w:rFonts w:ascii="Times New Roman" w:hAnsi="Times New Roman" w:eastAsia="Times New Roman" w:cs="Times New Roman"/>
+          <w:color w:val="000000"/>
+          <w:sz w:val="24"/>
+        </w:rPr>
+        <w:t xml:space="preserve"> </w:t>
+      </w:r>
+      <w:r>
+        <w:rPr>
+          <w:iCs/>
+          <w:rFonts w:ascii="Times New Roman" w:hAnsi="Times New Roman" w:eastAsia="Times New Roman" w:cs="Times New Roman"/>
+          <w:i/>
+          <w:color w:val="000000"/>
+          <w:sz w:val="24"/>
+        </w:rPr>
+        <w:t xml:space="preserve">pro se</w:t>
+      </w:r>
+      <w:r>
+        <w:rPr>
+          <w:rFonts w:ascii="Times New Roman" w:hAnsi="Times New Roman" w:eastAsia="Times New Roman" w:cs="Times New Roman"/>
+          <w:color w:val="000000"/>
+          <w:sz w:val="24"/>
+        </w:rPr>
+        <w:t xml:space="preserve">, respectfully moves this Court, pursuant to 18 U.S.C. § 3583(e)(2) and Federal Rule of Criminal Procedure 32.1(c), to modify the conditions of supervised release imposed by the Judgment entered June 12, 2018 (Dkt. 28). In support of this motion, Mr. Bernecky states as follows.</w:t>
       </w:r>
     </w:p>
     <w:bookmarkEnd w:id="20"/>
@@ -1805,7 +1831,7 @@
           <w:color w:val="000000"/>
           <w:sz w:val="24"/>
         </w:rPr>
-        <w:t xml:space="preserve">requirement as a de facto occupational restriction demanding that finding.</w:t>
+        <w:t xml:space="preserve">requirement as a</w:t>
       </w:r>
       <w:r>
         <w:rPr>
@@ -1823,6 +1849,40 @@
           <w:color w:val="000000"/>
           <w:sz w:val="24"/>
         </w:rPr>
+        <w:t xml:space="preserve">de facto</w:t>
+      </w:r>
+      <w:r>
+        <w:rPr>
+          <w:rFonts w:ascii="Times New Roman" w:hAnsi="Times New Roman" w:eastAsia="Times New Roman" w:cs="Times New Roman"/>
+          <w:color w:val="000000"/>
+          <w:sz w:val="24"/>
+        </w:rPr>
+        <w:t xml:space="preserve"> </w:t>
+      </w:r>
+      <w:r>
+        <w:rPr>
+          <w:rFonts w:ascii="Times New Roman" w:hAnsi="Times New Roman" w:eastAsia="Times New Roman" w:cs="Times New Roman"/>
+          <w:color w:val="000000"/>
+          <w:sz w:val="24"/>
+        </w:rPr>
+        <w:t xml:space="preserve">occupational restriction demanding that finding.</w:t>
+      </w:r>
+      <w:r>
+        <w:rPr>
+          <w:rFonts w:ascii="Times New Roman" w:hAnsi="Times New Roman" w:eastAsia="Times New Roman" w:cs="Times New Roman"/>
+          <w:color w:val="000000"/>
+          <w:sz w:val="24"/>
+        </w:rPr>
+        <w:t xml:space="preserve"> </w:t>
+      </w:r>
+      <w:r>
+        <w:rPr>
+          <w:iCs/>
+          <w:rFonts w:ascii="Times New Roman" w:hAnsi="Times New Roman" w:eastAsia="Times New Roman" w:cs="Times New Roman"/>
+          <w:i/>
+          <w:color w:val="000000"/>
+          <w:sz w:val="24"/>
+        </w:rPr>
         <w:t xml:space="preserve">See United States v. Love</w:t>
       </w:r>
       <w:r>
@@ -2925,7 +2985,7 @@
           <w:color w:val="000000"/>
           <w:sz w:val="24"/>
         </w:rPr>
-        <w:t xml:space="preserve">The Court should enter an order clarifying and, to the extent necessary, modifying Special Condition (a) to provide: (i) that Mr. Bernecky may satisfy any employer-facing aspect of the condition either by voluntary disclosure of his conviction to the employer, without any further employer-permission showing, or, independently, by the employer’s consent to monitoring of its own systems on an</w:t>
+        <w:t xml:space="preserve">The Court should enter an order clarifying and, to the extent necessary, modifying Special Condition (a) to provide: (i) that Special Condition (a) confers no authority over an employer’s own systems and imposes no obligation on any employer to demonstrate anything about its own monitoring capability, so that Mr. Bernecky’s voluntary disclosure of his conviction to the employer — which he has already made — is, on its own, all that this condition could ever require of him with respect to an employer; (ii) that the devices actually subject to monitoring are limited to those Mr. Bernecky owns and keeps or brings to his residence that are capable of accessing, storing, or displaying image content, consistent with the condition’s own</w:t>
       </w:r>
       <w:r>
         <w:rPr>
@@ -2949,6 +3009,95 @@
           <w:color w:val="000000"/>
           <w:sz w:val="24"/>
         </w:rPr>
+        <w:t xml:space="preserve">internet capable device</w:t>
+      </w:r>
+      <w:r>
+        <w:rPr>
+          <w:rFonts w:ascii="Times New Roman" w:hAnsi="Times New Roman" w:eastAsia="Times New Roman" w:cs="Times New Roman"/>
+          <w:color w:val="000000"/>
+          <w:sz w:val="24"/>
+        </w:rPr>
+        <w:t xml:space="preserve">”</w:t>
+      </w:r>
+      <w:r>
+        <w:rPr>
+          <w:rFonts w:ascii="Times New Roman" w:hAnsi="Times New Roman" w:eastAsia="Times New Roman" w:cs="Times New Roman"/>
+          <w:color w:val="000000"/>
+          <w:sz w:val="24"/>
+        </w:rPr>
+        <w:t xml:space="preserve"> </w:t>
+      </w:r>
+      <w:r>
+        <w:rPr>
+          <w:rFonts w:ascii="Times New Roman" w:hAnsi="Times New Roman" w:eastAsia="Times New Roman" w:cs="Times New Roman"/>
+          <w:color w:val="000000"/>
+          <w:sz w:val="24"/>
+        </w:rPr>
+        <w:t xml:space="preserve">language; and (iii) that Mr. Bernecky is prohibited from using another person’s personal device, in lieu of any monitoring or capability-parity demand directed at that person’s property. To be clear, Mr. Bernecky should never be placed in a position of having to choose between disclosing his conviction to an employer and asking that employer to permit monitoring of its own systems — the point of this relief is that neither is owed, and he has already done more than the condition requires by disclosing voluntarily.</w:t>
+      </w:r>
+    </w:p>
+    <w:p>
+      <w:pPr>
+        <w:pStyle w:val="BodyText"/>
+        <w:spacing w:line="480" w:lineRule="auto" w:before="0" w:after="0"/>
+        <w:ind w:firstLine="720"/>
+      </w:pPr>
+      <w:r>
+        <w:rPr>
+          <w:rFonts w:ascii="Times New Roman" w:hAnsi="Times New Roman" w:eastAsia="Times New Roman" w:cs="Times New Roman"/>
+          <w:color w:val="000000"/>
+          <w:sz w:val="24"/>
+        </w:rPr>
+        <w:t xml:space="preserve">Should the Court nonetheless conclude that some employer-facing framework remains appropriate, Mr. Bernecky requests, in the alternative, that any such framework track</w:t>
+      </w:r>
+      <w:r>
+        <w:rPr>
+          <w:rFonts w:ascii="Times New Roman" w:hAnsi="Times New Roman" w:eastAsia="Times New Roman" w:cs="Times New Roman"/>
+          <w:color w:val="000000"/>
+          <w:sz w:val="24"/>
+        </w:rPr>
+        <w:t xml:space="preserve"> </w:t>
+      </w:r>
+      <w:r>
+        <w:rPr>
+          <w:iCs/>
+          <w:rFonts w:ascii="Times New Roman" w:hAnsi="Times New Roman" w:eastAsia="Times New Roman" w:cs="Times New Roman"/>
+          <w:i/>
+          <w:color w:val="000000"/>
+          <w:sz w:val="24"/>
+        </w:rPr>
+        <w:t xml:space="preserve">Brown</w:t>
+      </w:r>
+      <w:r>
+        <w:rPr>
+          <w:rFonts w:ascii="Times New Roman" w:hAnsi="Times New Roman" w:eastAsia="Times New Roman" w:cs="Times New Roman"/>
+          <w:color w:val="000000"/>
+          <w:sz w:val="24"/>
+        </w:rPr>
+        <w:t xml:space="preserve">’s own</w:t>
+      </w:r>
+      <w:r>
+        <w:rPr>
+          <w:rFonts w:ascii="Times New Roman" w:hAnsi="Times New Roman" w:eastAsia="Times New Roman" w:cs="Times New Roman"/>
+          <w:color w:val="000000"/>
+          <w:sz w:val="24"/>
+        </w:rPr>
+        <w:t xml:space="preserve"> </w:t>
+      </w:r>
+      <w:r>
+        <w:rPr>
+          <w:rFonts w:ascii="Times New Roman" w:hAnsi="Times New Roman" w:eastAsia="Times New Roman" w:cs="Times New Roman"/>
+          <w:color w:val="000000"/>
+          <w:sz w:val="24"/>
+        </w:rPr>
+        <w:t xml:space="preserve">“</w:t>
+      </w:r>
+      <w:r>
+        <w:rPr>
+          <w:rFonts w:ascii="Times New Roman" w:hAnsi="Times New Roman" w:eastAsia="Times New Roman" w:cs="Times New Roman"/>
+          <w:color w:val="000000"/>
+          <w:sz w:val="24"/>
+        </w:rPr>
         <w:t xml:space="preserve">as permitted by the employer</w:t>
       </w:r>
       <w:r>
@@ -2973,81 +3122,7 @@
           <w:color w:val="000000"/>
           <w:sz w:val="24"/>
         </w:rPr>
-        <w:t xml:space="preserve">basis modeled on</w:t>
-      </w:r>
-      <w:r>
-        <w:rPr>
-          <w:rFonts w:ascii="Times New Roman" w:hAnsi="Times New Roman" w:eastAsia="Times New Roman" w:cs="Times New Roman"/>
-          <w:color w:val="000000"/>
-          <w:sz w:val="24"/>
-        </w:rPr>
-        <w:t xml:space="preserve"> </w:t>
-      </w:r>
-      <w:r>
-        <w:rPr>
-          <w:iCs/>
-          <w:rFonts w:ascii="Times New Roman" w:hAnsi="Times New Roman" w:eastAsia="Times New Roman" w:cs="Times New Roman"/>
-          <w:i/>
-          <w:color w:val="000000"/>
-          <w:sz w:val="24"/>
-        </w:rPr>
-        <w:t xml:space="preserve">Brown</w:t>
-      </w:r>
-      <w:r>
-        <w:rPr>
-          <w:rFonts w:ascii="Times New Roman" w:hAnsi="Times New Roman" w:eastAsia="Times New Roman" w:cs="Times New Roman"/>
-          <w:color w:val="000000"/>
-          <w:sz w:val="24"/>
-        </w:rPr>
-        <w:t xml:space="preserve">’s own structure — with an employer’s refusal to permit monitoring deemed neither a violation by Mr. Bernecky nor a bar to his employment; (ii) that the devices actually subject to monitoring are limited to those Mr. Bernecky owns and keeps or brings to his residence that are capable of accessing, storing, or displaying image content, consistent with the condition’s own</w:t>
-      </w:r>
-      <w:r>
-        <w:rPr>
-          <w:rFonts w:ascii="Times New Roman" w:hAnsi="Times New Roman" w:eastAsia="Times New Roman" w:cs="Times New Roman"/>
-          <w:color w:val="000000"/>
-          <w:sz w:val="24"/>
-        </w:rPr>
-        <w:t xml:space="preserve"> </w:t>
-      </w:r>
-      <w:r>
-        <w:rPr>
-          <w:rFonts w:ascii="Times New Roman" w:hAnsi="Times New Roman" w:eastAsia="Times New Roman" w:cs="Times New Roman"/>
-          <w:color w:val="000000"/>
-          <w:sz w:val="24"/>
-        </w:rPr>
-        <w:t xml:space="preserve">“</w:t>
-      </w:r>
-      <w:r>
-        <w:rPr>
-          <w:rFonts w:ascii="Times New Roman" w:hAnsi="Times New Roman" w:eastAsia="Times New Roman" w:cs="Times New Roman"/>
-          <w:color w:val="000000"/>
-          <w:sz w:val="24"/>
-        </w:rPr>
-        <w:t xml:space="preserve">internet capable device</w:t>
-      </w:r>
-      <w:r>
-        <w:rPr>
-          <w:rFonts w:ascii="Times New Roman" w:hAnsi="Times New Roman" w:eastAsia="Times New Roman" w:cs="Times New Roman"/>
-          <w:color w:val="000000"/>
-          <w:sz w:val="24"/>
-        </w:rPr>
-        <w:t xml:space="preserve">”</w:t>
-      </w:r>
-      <w:r>
-        <w:rPr>
-          <w:rFonts w:ascii="Times New Roman" w:hAnsi="Times New Roman" w:eastAsia="Times New Roman" w:cs="Times New Roman"/>
-          <w:color w:val="000000"/>
-          <w:sz w:val="24"/>
-        </w:rPr>
-        <w:t xml:space="preserve"> </w:t>
-      </w:r>
-      <w:r>
-        <w:rPr>
-          <w:rFonts w:ascii="Times New Roman" w:hAnsi="Times New Roman" w:eastAsia="Times New Roman" w:cs="Times New Roman"/>
-          <w:color w:val="000000"/>
-          <w:sz w:val="24"/>
-        </w:rPr>
-        <w:t xml:space="preserve">language; and (iii) that Mr. Bernecky is prohibited from using another person’s personal device, in lieu of any monitoring or capability-parity demand directed at that person’s property.</w:t>
+        <w:t xml:space="preserve">structure, with an employer’s refusal to permit monitoring deemed neither a violation by Mr. Bernecky nor a bar to his employment. Even under that alternative structure, Mr. Bernecky has already satisfied it: he disclosed his conviction to the employer voluntarily, which is all Path 1 of any such framework could require, and nothing further should ever be asked of him.</w:t>
       </w:r>
     </w:p>
     <w:bookmarkEnd w:id="24"/>
@@ -3842,7 +3917,45 @@
           <w:color w:val="000000"/>
           <w:sz w:val="24"/>
         </w:rPr>
-        <w:t xml:space="preserve">D. The Family-Contact Condition, as Written, Functions as a De Facto Ban on Ordinary Family Life</w:t>
+        <w:t xml:space="preserve">D. The Family-Contact Condition, as Written, Functions as a</w:t>
+      </w:r>
+      <w:r>
+        <w:rPr>
+          <w:rFonts w:ascii="Times New Roman" w:hAnsi="Times New Roman" w:eastAsia="Times New Roman" w:cs="Times New Roman"/>
+          <w:b/>
+          <w:color w:val="000000"/>
+          <w:sz w:val="24"/>
+        </w:rPr>
+        <w:t xml:space="preserve"> </w:t>
+      </w:r>
+      <w:r>
+        <w:rPr>
+          <w:iCs/>
+          <w:rFonts w:ascii="Times New Roman" w:hAnsi="Times New Roman" w:eastAsia="Times New Roman" w:cs="Times New Roman"/>
+          <w:b/>
+          <w:i/>
+          <w:color w:val="000000"/>
+          <w:sz w:val="24"/>
+        </w:rPr>
+        <w:t xml:space="preserve">De Facto</w:t>
+      </w:r>
+      <w:r>
+        <w:rPr>
+          <w:rFonts w:ascii="Times New Roman" w:hAnsi="Times New Roman" w:eastAsia="Times New Roman" w:cs="Times New Roman"/>
+          <w:b/>
+          <w:color w:val="000000"/>
+          <w:sz w:val="24"/>
+        </w:rPr>
+        <w:t xml:space="preserve"> </w:t>
+      </w:r>
+      <w:r>
+        <w:rPr>
+          <w:rFonts w:ascii="Times New Roman" w:hAnsi="Times New Roman" w:eastAsia="Times New Roman" w:cs="Times New Roman"/>
+          <w:b/>
+          <w:color w:val="000000"/>
+          <w:sz w:val="24"/>
+        </w:rPr>
+        <w:t xml:space="preserve">Ban on Ordinary Family Life</w:t>
       </w:r>
     </w:p>
     <w:p>
@@ -6075,7 +6188,25 @@
           <w:color w:val="000000"/>
           <w:sz w:val="24"/>
         </w:rPr>
-        <w:t xml:space="preserve">Defendant, Pro Se</w:t>
+        <w:t xml:space="preserve">Defendant,</w:t>
+      </w:r>
+      <w:r>
+        <w:rPr>
+          <w:rFonts w:ascii="Times New Roman" w:hAnsi="Times New Roman" w:eastAsia="Times New Roman" w:cs="Times New Roman"/>
+          <w:color w:val="000000"/>
+          <w:sz w:val="24"/>
+        </w:rPr>
+        <w:t xml:space="preserve"> </w:t>
+      </w:r>
+      <w:r>
+        <w:rPr>
+          <w:iCs/>
+          <w:rFonts w:ascii="Times New Roman" w:hAnsi="Times New Roman" w:eastAsia="Times New Roman" w:cs="Times New Roman"/>
+          <w:i/>
+          <w:color w:val="000000"/>
+          <w:sz w:val="24"/>
+        </w:rPr>
+        <w:t xml:space="preserve">Pro Se</w:t>
       </w:r>
     </w:p>
     <w:bookmarkEnd w:id="36"/>

</xml_diff>

<commit_message>
Remove employer-monitoring fallback and revocation framing per client feedback
- Part A.5: dropped the fallback alternative offering employer
  consent-to-monitoring as a Path 2. The only relief requested now is the
  clarification that there is no employer monitoring under this condition
  at all - stated directly in the relief itself, not just implied.
- Jurisdiction and Standard of Review: removed the paragraph discussing
  what happens at a future revocation/violation proceeding if this isn't
  resolved now (which read as implying an expectation that Bernecky will
  violate). Replaced with a short paragraph on why resolving the
  ambiguity now serves everyone's interest, with no reference to
  revocation or violation.
</commit_message>
<xml_diff>
--- a/case-files/bernecky/MOTION-DRAFT.docx
+++ b/case-files/bernecky/MOTION-DRAFT.docx
@@ -866,107 +866,7 @@
           <w:color w:val="000000"/>
           <w:sz w:val="24"/>
         </w:rPr>
-        <w:t xml:space="preserve">Finally, declining to resolve these disputes now would not make them disappear; it would only defer them to a proceeding with categorically higher stakes. A term of supervised release imposed after revocation under § 3583(h) is not an automatic continuation of the 2018 Judgment — it is a new, freestanding authorization that the district court decides, at a fresh sentencing event, whether to impose at all, and every condition attached to it — including one textually identical to a condition never objected to in 2018 — is imposed as part of that fresh sentencing act, fully subject to objection and appeal.</w:t>
-      </w:r>
-      <w:r>
-        <w:rPr>
-          <w:rFonts w:ascii="Times New Roman" w:hAnsi="Times New Roman" w:eastAsia="Times New Roman" w:cs="Times New Roman"/>
-          <w:color w:val="000000"/>
-          <w:sz w:val="24"/>
-        </w:rPr>
-        <w:t xml:space="preserve"> </w:t>
-      </w:r>
-      <w:r>
-        <w:rPr>
-          <w:iCs/>
-          <w:rFonts w:ascii="Times New Roman" w:hAnsi="Times New Roman" w:eastAsia="Times New Roman" w:cs="Times New Roman"/>
-          <w:i/>
-          <w:color w:val="000000"/>
-          <w:sz w:val="24"/>
-        </w:rPr>
-        <w:t xml:space="preserve">See United States v. Betts</w:t>
-      </w:r>
-      <w:r>
-        <w:rPr>
-          <w:rFonts w:ascii="Times New Roman" w:hAnsi="Times New Roman" w:eastAsia="Times New Roman" w:cs="Times New Roman"/>
-          <w:color w:val="000000"/>
-          <w:sz w:val="24"/>
-        </w:rPr>
-        <w:t xml:space="preserve">, 886 F.3d 198 (2d Cir. 2018) (this district; reviewing, and partly vacating, special conditions newly imposed at a revocation sentencing under the ordinary individualized-assessment standard, with no diminished scrutiny traceable to the original, unappealed judgment). No decision holds that a condition merely carried forward unchanged into a revocation-based term receives less scrutiny than the same condition would receive today. To the contrary, the Second Circuit has said, in language that speaks directly to why a defendant should not have to wait: a condition that</w:t>
-      </w:r>
-      <w:r>
-        <w:rPr>
-          <w:rFonts w:ascii="Times New Roman" w:hAnsi="Times New Roman" w:eastAsia="Times New Roman" w:cs="Times New Roman"/>
-          <w:color w:val="000000"/>
-          <w:sz w:val="24"/>
-        </w:rPr>
-        <w:t xml:space="preserve"> </w:t>
-      </w:r>
-      <w:r>
-        <w:rPr>
-          <w:rFonts w:ascii="Times New Roman" w:hAnsi="Times New Roman" w:eastAsia="Times New Roman" w:cs="Times New Roman"/>
-          <w:color w:val="000000"/>
-          <w:sz w:val="24"/>
-        </w:rPr>
-        <w:t xml:space="preserve">“</w:t>
-      </w:r>
-      <w:r>
-        <w:rPr>
-          <w:rFonts w:ascii="Times New Roman" w:hAnsi="Times New Roman" w:eastAsia="Times New Roman" w:cs="Times New Roman"/>
-          <w:color w:val="000000"/>
-          <w:sz w:val="24"/>
-        </w:rPr>
-        <w:t xml:space="preserve">fail[s] to inform [a defendant] what he must do . . . to avoid a violation proceeding</w:t>
-      </w:r>
-      <w:r>
-        <w:rPr>
-          <w:rFonts w:ascii="Times New Roman" w:hAnsi="Times New Roman" w:eastAsia="Times New Roman" w:cs="Times New Roman"/>
-          <w:color w:val="000000"/>
-          <w:sz w:val="24"/>
-        </w:rPr>
-        <w:t xml:space="preserve">”</w:t>
-      </w:r>
-      <w:r>
-        <w:rPr>
-          <w:rFonts w:ascii="Times New Roman" w:hAnsi="Times New Roman" w:eastAsia="Times New Roman" w:cs="Times New Roman"/>
-          <w:color w:val="000000"/>
-          <w:sz w:val="24"/>
-        </w:rPr>
-        <w:t xml:space="preserve"> </w:t>
-      </w:r>
-      <w:r>
-        <w:rPr>
-          <w:rFonts w:ascii="Times New Roman" w:hAnsi="Times New Roman" w:eastAsia="Times New Roman" w:cs="Times New Roman"/>
-          <w:color w:val="000000"/>
-          <w:sz w:val="24"/>
-        </w:rPr>
-        <w:t xml:space="preserve">is itself constitutionally infirm.</w:t>
-      </w:r>
-      <w:r>
-        <w:rPr>
-          <w:rFonts w:ascii="Times New Roman" w:hAnsi="Times New Roman" w:eastAsia="Times New Roman" w:cs="Times New Roman"/>
-          <w:color w:val="000000"/>
-          <w:sz w:val="24"/>
-        </w:rPr>
-        <w:t xml:space="preserve"> </w:t>
-      </w:r>
-      <w:r>
-        <w:rPr>
-          <w:iCs/>
-          <w:rFonts w:ascii="Times New Roman" w:hAnsi="Times New Roman" w:eastAsia="Times New Roman" w:cs="Times New Roman"/>
-          <w:i/>
-          <w:color w:val="000000"/>
-          <w:sz w:val="24"/>
-        </w:rPr>
-        <w:t xml:space="preserve">United States v. Carlineo</w:t>
-      </w:r>
-      <w:r>
-        <w:rPr>
-          <w:rFonts w:ascii="Times New Roman" w:hAnsi="Times New Roman" w:eastAsia="Times New Roman" w:cs="Times New Roman"/>
-          <w:color w:val="000000"/>
-          <w:sz w:val="24"/>
-        </w:rPr>
-        <w:t xml:space="preserve">, 998 F.3d 533, 539 (2d Cir. 2021). The same value that condemns a vague condition — that a person should not have to guess, under threat of a violation proceeding, what is required of him — supports resolving these disputes now, on a clean record, rather than waiting to find out, possibly through an actual violation, what these conditions permit.</w:t>
+        <w:t xml:space="preserve">Finally, there is no reason to wait. Mr. Bernecky’s supervision has not yet begun, and the uncertainty described in Part A is already causing real harm before it does. A condition’s scope should not be left to be worked out through informal, shifting assurances after the fact; it should be clear from the outset, for Probation’s benefit, for any employer’s benefit, and for Mr. Bernecky’s own. Resolving these questions now, on the current record, serves that interest far better than leaving them unresolved.</w:t>
       </w:r>
     </w:p>
     <w:bookmarkEnd w:id="22"/>
@@ -2985,7 +2885,7 @@
           <w:color w:val="000000"/>
           <w:sz w:val="24"/>
         </w:rPr>
-        <w:t xml:space="preserve">The Court should enter an order clarifying and, to the extent necessary, modifying Special Condition (a) to provide: (i) that Special Condition (a) confers no authority over an employer’s own systems and imposes no obligation on any employer to demonstrate anything about its own monitoring capability, so that Mr. Bernecky’s voluntary disclosure of his conviction to the employer — which he has already made — is, on its own, all that this condition could ever require of him with respect to an employer; (ii) that the devices actually subject to monitoring are limited to those Mr. Bernecky owns and keeps or brings to his residence that are capable of accessing, storing, or displaying image content, consistent with the condition’s own</w:t>
+        <w:t xml:space="preserve">The Court should enter an order clarifying and, to the extent necessary, modifying Special Condition (a) to provide: (i) that Special Condition (a) confers no authority over an employer’s own systems and imposes no obligation on any employer to demonstrate anything about its own monitoring capability — there is no employer monitoring under this condition, and Mr. Bernecky’s voluntary disclosure of his conviction to the employer, which he has already made, is more than the condition could ever require of him with respect to an employer; (ii) that the devices actually subject to monitoring are limited to those Mr. Bernecky owns and keeps or brings to his residence that are capable of accessing, storing, or displaying image content, consistent with the condition’s own</w:t>
       </w:r>
       <w:r>
         <w:rPr>
@@ -3033,96 +2933,7 @@
           <w:color w:val="000000"/>
           <w:sz w:val="24"/>
         </w:rPr>
-        <w:t xml:space="preserve">language; and (iii) that Mr. Bernecky is prohibited from using another person’s personal device, in lieu of any monitoring or capability-parity demand directed at that person’s property. To be clear, Mr. Bernecky should never be placed in a position of having to choose between disclosing his conviction to an employer and asking that employer to permit monitoring of its own systems — the point of this relief is that neither is owed, and he has already done more than the condition requires by disclosing voluntarily.</w:t>
-      </w:r>
-    </w:p>
-    <w:p>
-      <w:pPr>
-        <w:pStyle w:val="BodyText"/>
-        <w:spacing w:line="480" w:lineRule="auto" w:before="0" w:after="0"/>
-        <w:ind w:firstLine="720"/>
-      </w:pPr>
-      <w:r>
-        <w:rPr>
-          <w:rFonts w:ascii="Times New Roman" w:hAnsi="Times New Roman" w:eastAsia="Times New Roman" w:cs="Times New Roman"/>
-          <w:color w:val="000000"/>
-          <w:sz w:val="24"/>
-        </w:rPr>
-        <w:t xml:space="preserve">Should the Court nonetheless conclude that some employer-facing framework remains appropriate, Mr. Bernecky requests, in the alternative, that any such framework track</w:t>
-      </w:r>
-      <w:r>
-        <w:rPr>
-          <w:rFonts w:ascii="Times New Roman" w:hAnsi="Times New Roman" w:eastAsia="Times New Roman" w:cs="Times New Roman"/>
-          <w:color w:val="000000"/>
-          <w:sz w:val="24"/>
-        </w:rPr>
-        <w:t xml:space="preserve"> </w:t>
-      </w:r>
-      <w:r>
-        <w:rPr>
-          <w:iCs/>
-          <w:rFonts w:ascii="Times New Roman" w:hAnsi="Times New Roman" w:eastAsia="Times New Roman" w:cs="Times New Roman"/>
-          <w:i/>
-          <w:color w:val="000000"/>
-          <w:sz w:val="24"/>
-        </w:rPr>
-        <w:t xml:space="preserve">Brown</w:t>
-      </w:r>
-      <w:r>
-        <w:rPr>
-          <w:rFonts w:ascii="Times New Roman" w:hAnsi="Times New Roman" w:eastAsia="Times New Roman" w:cs="Times New Roman"/>
-          <w:color w:val="000000"/>
-          <w:sz w:val="24"/>
-        </w:rPr>
-        <w:t xml:space="preserve">’s own</w:t>
-      </w:r>
-      <w:r>
-        <w:rPr>
-          <w:rFonts w:ascii="Times New Roman" w:hAnsi="Times New Roman" w:eastAsia="Times New Roman" w:cs="Times New Roman"/>
-          <w:color w:val="000000"/>
-          <w:sz w:val="24"/>
-        </w:rPr>
-        <w:t xml:space="preserve"> </w:t>
-      </w:r>
-      <w:r>
-        <w:rPr>
-          <w:rFonts w:ascii="Times New Roman" w:hAnsi="Times New Roman" w:eastAsia="Times New Roman" w:cs="Times New Roman"/>
-          <w:color w:val="000000"/>
-          <w:sz w:val="24"/>
-        </w:rPr>
-        <w:t xml:space="preserve">“</w:t>
-      </w:r>
-      <w:r>
-        <w:rPr>
-          <w:rFonts w:ascii="Times New Roman" w:hAnsi="Times New Roman" w:eastAsia="Times New Roman" w:cs="Times New Roman"/>
-          <w:color w:val="000000"/>
-          <w:sz w:val="24"/>
-        </w:rPr>
-        <w:t xml:space="preserve">as permitted by the employer</w:t>
-      </w:r>
-      <w:r>
-        <w:rPr>
-          <w:rFonts w:ascii="Times New Roman" w:hAnsi="Times New Roman" w:eastAsia="Times New Roman" w:cs="Times New Roman"/>
-          <w:color w:val="000000"/>
-          <w:sz w:val="24"/>
-        </w:rPr>
-        <w:t xml:space="preserve">”</w:t>
-      </w:r>
-      <w:r>
-        <w:rPr>
-          <w:rFonts w:ascii="Times New Roman" w:hAnsi="Times New Roman" w:eastAsia="Times New Roman" w:cs="Times New Roman"/>
-          <w:color w:val="000000"/>
-          <w:sz w:val="24"/>
-        </w:rPr>
-        <w:t xml:space="preserve"> </w:t>
-      </w:r>
-      <w:r>
-        <w:rPr>
-          <w:rFonts w:ascii="Times New Roman" w:hAnsi="Times New Roman" w:eastAsia="Times New Roman" w:cs="Times New Roman"/>
-          <w:color w:val="000000"/>
-          <w:sz w:val="24"/>
-        </w:rPr>
-        <w:t xml:space="preserve">structure, with an employer’s refusal to permit monitoring deemed neither a violation by Mr. Bernecky nor a bar to his employment. Even under that alternative structure, Mr. Bernecky has already satisfied it: he disclosed his conviction to the employer voluntarily, which is all Path 1 of any such framework could require, and nothing further should ever be asked of him.</w:t>
+        <w:t xml:space="preserve">language; and (iii) that Mr. Bernecky is prohibited from using another person’s personal device, in lieu of any monitoring or capability-parity demand directed at that person’s property. The clarification requested in (i) is the relief that matters most: Mr. Bernecky should never be placed in a position of having to choose between disclosing his conviction to an employer and asking that employer to permit monitoring of its own systems, because neither is owed at all.</w:t>
       </w:r>
     </w:p>
     <w:bookmarkEnd w:id="24"/>

</xml_diff>